<commit_message>
Add Prometheus + Grafana monitoring stack with per-Pod scraping
Endpoint-based service discovery scrapes each replica individually rather than
through the Service DNS, which kube-proxy would load-balance to one random Pod
per scrape. This closes the per-process metrics limitation the API has on its
own. Grafana's datasource and 9-panel dashboard are provisioned from ConfigMaps
so the stack is reproducible from the manifests alone.
</commit_message>
<xml_diff>
--- a/docs/MLOps-Assignment-2-Report.docx
+++ b/docs/MLOps-Assignment-2-Report.docx
@@ -94,14 +94,14 @@
       <w:r>
         <w:t xml:space="preserve">Repository: </w:t>
       </w:r>
-      <w:r>
-        <w:rPr>
-          <w:b/>
-          <w:bCs/>
-          <w:color w:val="C00000"/>
-        </w:rPr>
-        <w:t>&lt;INSERT GITHUB REPOSITORY LINK&gt;</w:t>
-      </w:r>
+      <w:hyperlink r:id="rId5" w:history="1">
+        <w:r>
+          <w:rPr>
+            <w:rStyle w:val="Hyperlink"/>
+          </w:rPr>
+          <w:t>https://github.com/Srinivas-bitspilani/Assignment-2-MLOPS</w:t>
+        </w:r>
+      </w:hyperlink>
     </w:p>
     <w:p>
       <w:r>
@@ -874,12 +874,6 @@
         <w:gridCol w:w="1860"/>
       </w:tblGrid>
       <w:tr>
-        <w:tblPrEx>
-          <w:tblCellMar>
-            <w:top w:w="0" w:type="dxa"/>
-            <w:bottom w:w="0" w:type="dxa"/>
-          </w:tblCellMar>
-        </w:tblPrEx>
         <w:trPr>
           <w:tblHeader/>
         </w:trPr>
@@ -1005,12 +999,6 @@
         </w:tc>
       </w:tr>
       <w:tr>
-        <w:tblPrEx>
-          <w:tblCellMar>
-            <w:top w:w="0" w:type="dxa"/>
-            <w:bottom w:w="0" w:type="dxa"/>
-          </w:tblCellMar>
-        </w:tblPrEx>
         <w:tc>
           <w:tcPr>
             <w:tcW w:w="2200" w:type="dxa"/>
@@ -1115,12 +1103,6 @@
         </w:tc>
       </w:tr>
       <w:tr>
-        <w:tblPrEx>
-          <w:tblCellMar>
-            <w:top w:w="0" w:type="dxa"/>
-            <w:bottom w:w="0" w:type="dxa"/>
-          </w:tblCellMar>
-        </w:tblPrEx>
         <w:tc>
           <w:tcPr>
             <w:tcW w:w="2200" w:type="dxa"/>
@@ -1230,12 +1212,6 @@
         </w:tc>
       </w:tr>
       <w:tr>
-        <w:tblPrEx>
-          <w:tblCellMar>
-            <w:top w:w="0" w:type="dxa"/>
-            <w:bottom w:w="0" w:type="dxa"/>
-          </w:tblCellMar>
-        </w:tblPrEx>
         <w:tc>
           <w:tcPr>
             <w:tcW w:w="2200" w:type="dxa"/>
@@ -1408,7 +1384,7 @@
                     </pic:cNvPicPr>
                   </pic:nvPicPr>
                   <pic:blipFill>
-                    <a:blip r:embed="rId5"/>
+                    <a:blip r:embed="rId6"/>
                     <a:srcRect/>
                     <a:stretch>
                       <a:fillRect/>
@@ -1541,12 +1517,6 @@
         <w:gridCol w:w="1360"/>
       </w:tblGrid>
       <w:tr>
-        <w:tblPrEx>
-          <w:tblCellMar>
-            <w:top w:w="0" w:type="dxa"/>
-            <w:bottom w:w="0" w:type="dxa"/>
-          </w:tblCellMar>
-        </w:tblPrEx>
         <w:trPr>
           <w:tblHeader/>
         </w:trPr>
@@ -1696,12 +1666,6 @@
         </w:tc>
       </w:tr>
       <w:tr>
-        <w:tblPrEx>
-          <w:tblCellMar>
-            <w:top w:w="0" w:type="dxa"/>
-            <w:bottom w:w="0" w:type="dxa"/>
-          </w:tblCellMar>
-        </w:tblPrEx>
         <w:tc>
           <w:tcPr>
             <w:tcW w:w="2600" w:type="dxa"/>
@@ -1826,12 +1790,6 @@
         </w:tc>
       </w:tr>
       <w:tr>
-        <w:tblPrEx>
-          <w:tblCellMar>
-            <w:top w:w="0" w:type="dxa"/>
-            <w:bottom w:w="0" w:type="dxa"/>
-          </w:tblCellMar>
-        </w:tblPrEx>
         <w:tc>
           <w:tcPr>
             <w:tcW w:w="2600" w:type="dxa"/>
@@ -1989,71 +1947,6 @@
             <wp:extent cx="5715000" cy="2076450"/>
             <wp:effectExtent l="0" t="0" r="0" b="0"/>
             <wp:docPr id="1127564405" name="Picture 1127564405"/>
-            <wp:cNvGraphicFramePr>
-              <a:graphicFrameLocks xmlns:a="http://schemas.openxmlformats.org/drawingml/2006/main" noChangeAspect="1"/>
-            </wp:cNvGraphicFramePr>
-            <a:graphic xmlns:a="http://schemas.openxmlformats.org/drawingml/2006/main">
-              <a:graphicData uri="http://schemas.openxmlformats.org/drawingml/2006/picture">
-                <pic:pic xmlns:pic="http://schemas.openxmlformats.org/drawingml/2006/picture">
-                  <pic:nvPicPr>
-                    <pic:cNvPr id="0" name=""/>
-                    <pic:cNvPicPr>
-                      <a:picLocks noChangeAspect="1" noChangeArrowheads="1"/>
-                    </pic:cNvPicPr>
-                  </pic:nvPicPr>
-                  <pic:blipFill>
-                    <a:blip r:embed="rId6"/>
-                    <a:srcRect/>
-                    <a:stretch>
-                      <a:fillRect/>
-                    </a:stretch>
-                  </pic:blipFill>
-                  <pic:spPr bwMode="auto">
-                    <a:xfrm>
-                      <a:off x="0" y="0"/>
-                      <a:ext cx="5715000" cy="2076450"/>
-                    </a:xfrm>
-                    <a:prstGeom prst="rect">
-                      <a:avLst/>
-                    </a:prstGeom>
-                  </pic:spPr>
-                </pic:pic>
-              </a:graphicData>
-            </a:graphic>
-          </wp:inline>
-        </w:drawing>
-      </w:r>
-    </w:p>
-    <w:p>
-      <w:pPr>
-        <w:spacing w:after="220"/>
-        <w:jc w:val="center"/>
-      </w:pPr>
-      <w:r>
-        <w:rPr>
-          <w:i/>
-          <w:iCs/>
-          <w:color w:val="595959"/>
-          <w:sz w:val="18"/>
-          <w:szCs w:val="18"/>
-        </w:rPr>
-        <w:t>Figure 2. Baseline CNN loss and accuracy curves. Validation loss bottoms out at epoch 8 and then climbs, which is why the trainer restores the best weights rather than the last.</w:t>
-      </w:r>
-    </w:p>
-    <w:p>
-      <w:pPr>
-        <w:spacing w:before="120" w:after="60"/>
-        <w:jc w:val="center"/>
-      </w:pPr>
-      <w:r>
-        <w:rPr>
-          <w:noProof/>
-        </w:rPr>
-        <w:drawing>
-          <wp:inline distT="0" distB="0" distL="0" distR="0" wp14:anchorId="19EF7899" wp14:editId="19EF789A">
-            <wp:extent cx="5715000" cy="2076450"/>
-            <wp:effectExtent l="0" t="0" r="0" b="0"/>
-            <wp:docPr id="364902812" name="Picture 364902812"/>
             <wp:cNvGraphicFramePr>
               <a:graphicFrameLocks xmlns:a="http://schemas.openxmlformats.org/drawingml/2006/main" noChangeAspect="1"/>
             </wp:cNvGraphicFramePr>
@@ -2102,7 +1995,7 @@
           <w:sz w:val="18"/>
           <w:szCs w:val="18"/>
         </w:rPr>
-        <w:t>Figure 3. ResNet18 fine-tuning curves - validation accuracy passes 0.97 within one epoch.</w:t>
+        <w:t>Figure 2. Baseline CNN loss and accuracy curves. Validation loss bottoms out at epoch 8 and then climbs, which is why the trainer restores the best weights rather than the last.</w:t>
       </w:r>
     </w:p>
     <w:p>
@@ -2114,12 +2007,11 @@
         <w:rPr>
           <w:noProof/>
         </w:rPr>
-        <w:lastRenderedPageBreak/>
         <w:drawing>
-          <wp:inline distT="0" distB="0" distL="0" distR="0" wp14:anchorId="19EF789B" wp14:editId="19EF789C">
-            <wp:extent cx="3143250" cy="2828925"/>
+          <wp:inline distT="0" distB="0" distL="0" distR="0" wp14:anchorId="19EF7899" wp14:editId="19EF789A">
+            <wp:extent cx="5715000" cy="2076450"/>
             <wp:effectExtent l="0" t="0" r="0" b="0"/>
-            <wp:docPr id="404938267" name="Picture 404938267"/>
+            <wp:docPr id="364902812" name="Picture 364902812"/>
             <wp:cNvGraphicFramePr>
               <a:graphicFrameLocks xmlns:a="http://schemas.openxmlformats.org/drawingml/2006/main" noChangeAspect="1"/>
             </wp:cNvGraphicFramePr>
@@ -2142,7 +2034,7 @@
                   <pic:spPr bwMode="auto">
                     <a:xfrm>
                       <a:off x="0" y="0"/>
-                      <a:ext cx="3143250" cy="2828925"/>
+                      <a:ext cx="5715000" cy="2076450"/>
                     </a:xfrm>
                     <a:prstGeom prst="rect">
                       <a:avLst/>
@@ -2168,7 +2060,7 @@
           <w:sz w:val="18"/>
           <w:szCs w:val="18"/>
         </w:rPr>
-        <w:t>Figure 4. Baseline CNN holdout confusion matrix (errors balanced 57 vs 53).</w:t>
+        <w:t>Figure 3. ResNet18 fine-tuning curves - validation accuracy passes 0.97 within one epoch.</w:t>
       </w:r>
     </w:p>
     <w:p>
@@ -2180,11 +2072,12 @@
         <w:rPr>
           <w:noProof/>
         </w:rPr>
+        <w:lastRenderedPageBreak/>
         <w:drawing>
-          <wp:inline distT="0" distB="0" distL="0" distR="0" wp14:anchorId="19EF789D" wp14:editId="19EF789E">
+          <wp:inline distT="0" distB="0" distL="0" distR="0" wp14:anchorId="19EF789B" wp14:editId="19EF789C">
             <wp:extent cx="3143250" cy="2828925"/>
             <wp:effectExtent l="0" t="0" r="0" b="0"/>
-            <wp:docPr id="2120276652" name="Picture 2120276652"/>
+            <wp:docPr id="404938267" name="Picture 404938267"/>
             <wp:cNvGraphicFramePr>
               <a:graphicFrameLocks xmlns:a="http://schemas.openxmlformats.org/drawingml/2006/main" noChangeAspect="1"/>
             </wp:cNvGraphicFramePr>
@@ -2233,6 +2126,71 @@
           <w:sz w:val="18"/>
           <w:szCs w:val="18"/>
         </w:rPr>
+        <w:t>Figure 4. Baseline CNN holdout confusion matrix (errors balanced 57 vs 53).</w:t>
+      </w:r>
+    </w:p>
+    <w:p>
+      <w:pPr>
+        <w:spacing w:before="120" w:after="60"/>
+        <w:jc w:val="center"/>
+      </w:pPr>
+      <w:r>
+        <w:rPr>
+          <w:noProof/>
+        </w:rPr>
+        <w:drawing>
+          <wp:inline distT="0" distB="0" distL="0" distR="0" wp14:anchorId="19EF789D" wp14:editId="19EF789E">
+            <wp:extent cx="3143250" cy="2828925"/>
+            <wp:effectExtent l="0" t="0" r="0" b="0"/>
+            <wp:docPr id="2120276652" name="Picture 2120276652"/>
+            <wp:cNvGraphicFramePr>
+              <a:graphicFrameLocks xmlns:a="http://schemas.openxmlformats.org/drawingml/2006/main" noChangeAspect="1"/>
+            </wp:cNvGraphicFramePr>
+            <a:graphic xmlns:a="http://schemas.openxmlformats.org/drawingml/2006/main">
+              <a:graphicData uri="http://schemas.openxmlformats.org/drawingml/2006/picture">
+                <pic:pic xmlns:pic="http://schemas.openxmlformats.org/drawingml/2006/picture">
+                  <pic:nvPicPr>
+                    <pic:cNvPr id="0" name=""/>
+                    <pic:cNvPicPr>
+                      <a:picLocks noChangeAspect="1" noChangeArrowheads="1"/>
+                    </pic:cNvPicPr>
+                  </pic:nvPicPr>
+                  <pic:blipFill>
+                    <a:blip r:embed="rId10"/>
+                    <a:srcRect/>
+                    <a:stretch>
+                      <a:fillRect/>
+                    </a:stretch>
+                  </pic:blipFill>
+                  <pic:spPr bwMode="auto">
+                    <a:xfrm>
+                      <a:off x="0" y="0"/>
+                      <a:ext cx="3143250" cy="2828925"/>
+                    </a:xfrm>
+                    <a:prstGeom prst="rect">
+                      <a:avLst/>
+                    </a:prstGeom>
+                  </pic:spPr>
+                </pic:pic>
+              </a:graphicData>
+            </a:graphic>
+          </wp:inline>
+        </w:drawing>
+      </w:r>
+    </w:p>
+    <w:p>
+      <w:pPr>
+        <w:spacing w:after="220"/>
+        <w:jc w:val="center"/>
+      </w:pPr>
+      <w:r>
+        <w:rPr>
+          <w:i/>
+          <w:iCs/>
+          <w:color w:val="595959"/>
+          <w:sz w:val="18"/>
+          <w:szCs w:val="18"/>
+        </w:rPr>
         <w:t>Figure 5. ResNet18 holdout confusion matrix - 5 errors per class, symmetric.</w:t>
       </w:r>
     </w:p>
@@ -2309,12 +2267,6 @@
         <w:gridCol w:w="1900"/>
       </w:tblGrid>
       <w:tr>
-        <w:tblPrEx>
-          <w:tblCellMar>
-            <w:top w:w="0" w:type="dxa"/>
-            <w:bottom w:w="0" w:type="dxa"/>
-          </w:tblCellMar>
-        </w:tblPrEx>
         <w:trPr>
           <w:tblHeader/>
         </w:trPr>
@@ -2416,12 +2368,6 @@
         </w:tc>
       </w:tr>
       <w:tr>
-        <w:tblPrEx>
-          <w:tblCellMar>
-            <w:top w:w="0" w:type="dxa"/>
-            <w:bottom w:w="0" w:type="dxa"/>
-          </w:tblCellMar>
-        </w:tblPrEx>
         <w:tc>
           <w:tcPr>
             <w:tcW w:w="1700" w:type="dxa"/>
@@ -2506,12 +2452,6 @@
         </w:tc>
       </w:tr>
       <w:tr>
-        <w:tblPrEx>
-          <w:tblCellMar>
-            <w:top w:w="0" w:type="dxa"/>
-            <w:bottom w:w="0" w:type="dxa"/>
-          </w:tblCellMar>
-        </w:tblPrEx>
         <w:tc>
           <w:tcPr>
             <w:tcW w:w="1700" w:type="dxa"/>
@@ -2600,12 +2540,6 @@
         </w:tc>
       </w:tr>
       <w:tr>
-        <w:tblPrEx>
-          <w:tblCellMar>
-            <w:top w:w="0" w:type="dxa"/>
-            <w:bottom w:w="0" w:type="dxa"/>
-          </w:tblCellMar>
-        </w:tblPrEx>
         <w:tc>
           <w:tcPr>
             <w:tcW w:w="1700" w:type="dxa"/>
@@ -2690,12 +2624,6 @@
         </w:tc>
       </w:tr>
       <w:tr>
-        <w:tblPrEx>
-          <w:tblCellMar>
-            <w:top w:w="0" w:type="dxa"/>
-            <w:bottom w:w="0" w:type="dxa"/>
-          </w:tblCellMar>
-        </w:tblPrEx>
         <w:tc>
           <w:tcPr>
             <w:tcW w:w="1700" w:type="dxa"/>
@@ -2784,12 +2712,6 @@
         </w:tc>
       </w:tr>
       <w:tr>
-        <w:tblPrEx>
-          <w:tblCellMar>
-            <w:top w:w="0" w:type="dxa"/>
-            <w:bottom w:w="0" w:type="dxa"/>
-          </w:tblCellMar>
-        </w:tblPrEx>
         <w:tc>
           <w:tcPr>
             <w:tcW w:w="1700" w:type="dxa"/>
@@ -2874,12 +2796,6 @@
         </w:tc>
       </w:tr>
       <w:tr>
-        <w:tblPrEx>
-          <w:tblCellMar>
-            <w:top w:w="0" w:type="dxa"/>
-            <w:bottom w:w="0" w:type="dxa"/>
-          </w:tblCellMar>
-        </w:tblPrEx>
         <w:tc>
           <w:tcPr>
             <w:tcW w:w="1700" w:type="dxa"/>
@@ -3135,6 +3051,7 @@
         <w:rPr>
           <w:i/>
           <w:iCs/>
+          <w:noProof/>
           <w:color w:val="595959"/>
           <w:sz w:val="18"/>
           <w:szCs w:val="18"/>
@@ -3155,7 +3072,7 @@
                     <pic:cNvPicPr/>
                   </pic:nvPicPr>
                   <pic:blipFill>
-                    <a:blip r:embed="rId10"/>
+                    <a:blip r:embed="rId11"/>
                     <a:stretch>
                       <a:fillRect/>
                     </a:stretch>
@@ -3244,7 +3161,7 @@
                     </pic:cNvPicPr>
                   </pic:nvPicPr>
                   <pic:blipFill>
-                    <a:blip r:embed="rId11" cstate="print">
+                    <a:blip r:embed="rId12" cstate="print">
                       <a:extLst>
                         <a:ext uri="{28A0092B-C50C-407E-A947-70E740481C1C}">
                           <a14:useLocalDpi xmlns:a14="http://schemas.microsoft.com/office/drawing/2010/main" val="0"/>
@@ -3354,12 +3271,6 @@
         <w:gridCol w:w="6060"/>
       </w:tblGrid>
       <w:tr>
-        <w:tblPrEx>
-          <w:tblCellMar>
-            <w:top w:w="0" w:type="dxa"/>
-            <w:bottom w:w="0" w:type="dxa"/>
-          </w:tblCellMar>
-        </w:tblPrEx>
         <w:trPr>
           <w:tblHeader/>
         </w:trPr>
@@ -3438,12 +3349,6 @@
         </w:tc>
       </w:tr>
       <w:tr>
-        <w:tblPrEx>
-          <w:tblCellMar>
-            <w:top w:w="0" w:type="dxa"/>
-            <w:bottom w:w="0" w:type="dxa"/>
-          </w:tblCellMar>
-        </w:tblPrEx>
         <w:tc>
           <w:tcPr>
             <w:tcW w:w="2400" w:type="dxa"/>
@@ -3508,12 +3413,6 @@
         </w:tc>
       </w:tr>
       <w:tr>
-        <w:tblPrEx>
-          <w:tblCellMar>
-            <w:top w:w="0" w:type="dxa"/>
-            <w:bottom w:w="0" w:type="dxa"/>
-          </w:tblCellMar>
-        </w:tblPrEx>
         <w:tc>
           <w:tcPr>
             <w:tcW w:w="2400" w:type="dxa"/>
@@ -3581,12 +3480,6 @@
         </w:tc>
       </w:tr>
       <w:tr>
-        <w:tblPrEx>
-          <w:tblCellMar>
-            <w:top w:w="0" w:type="dxa"/>
-            <w:bottom w:w="0" w:type="dxa"/>
-          </w:tblCellMar>
-        </w:tblPrEx>
         <w:tc>
           <w:tcPr>
             <w:tcW w:w="2400" w:type="dxa"/>
@@ -3651,12 +3544,6 @@
         </w:tc>
       </w:tr>
       <w:tr>
-        <w:tblPrEx>
-          <w:tblCellMar>
-            <w:top w:w="0" w:type="dxa"/>
-            <w:bottom w:w="0" w:type="dxa"/>
-          </w:tblCellMar>
-        </w:tblPrEx>
         <w:tc>
           <w:tcPr>
             <w:tcW w:w="2400" w:type="dxa"/>
@@ -3762,6 +3649,7 @@
         <w:rPr>
           <w:i/>
           <w:iCs/>
+          <w:noProof/>
           <w:color w:val="595959"/>
           <w:sz w:val="18"/>
           <w:szCs w:val="18"/>
@@ -3783,7 +3671,7 @@
                     <pic:cNvPicPr/>
                   </pic:nvPicPr>
                   <pic:blipFill>
-                    <a:blip r:embed="rId12"/>
+                    <a:blip r:embed="rId13"/>
                     <a:stretch>
                       <a:fillRect/>
                     </a:stretch>
@@ -3825,6 +3713,7 @@
           <w:bCs/>
           <w:i/>
           <w:iCs/>
+          <w:noProof/>
           <w:color w:val="C00000"/>
           <w:sz w:val="20"/>
           <w:szCs w:val="20"/>
@@ -3845,7 +3734,7 @@
                     <pic:cNvPicPr/>
                   </pic:nvPicPr>
                   <pic:blipFill>
-                    <a:blip r:embed="rId13"/>
+                    <a:blip r:embed="rId14"/>
                     <a:stretch>
                       <a:fillRect/>
                     </a:stretch>
@@ -3937,6 +3826,7 @@
         <w:rPr>
           <w:i/>
           <w:iCs/>
+          <w:noProof/>
           <w:color w:val="595959"/>
           <w:sz w:val="18"/>
           <w:szCs w:val="18"/>
@@ -3957,7 +3847,7 @@
                     <pic:cNvPicPr/>
                   </pic:nvPicPr>
                   <pic:blipFill>
-                    <a:blip r:embed="rId14"/>
+                    <a:blip r:embed="rId15"/>
                     <a:stretch>
                       <a:fillRect/>
                     </a:stretch>
@@ -4195,19 +4085,13 @@
       </w:pPr>
       <w:r>
         <w:rPr>
-          <w:b/>
-          <w:bCs/>
-          <w:i/>
-          <w:iCs/>
-          <w:color w:val="C00000"/>
-          <w:sz w:val="20"/>
-          <w:szCs w:val="20"/>
+          <w:noProof/>
         </w:rPr>
         <w:drawing>
-          <wp:inline distT="0" distB="0" distL="0" distR="0" wp14:anchorId="1F0831C7" wp14:editId="5EFC728B">
-            <wp:extent cx="5943600" cy="2969895"/>
-            <wp:effectExtent l="0" t="0" r="0" b="1905"/>
-            <wp:docPr id="27693877" name="Picture 1"/>
+          <wp:inline distT="0" distB="0" distL="0" distR="0" wp14:anchorId="1587B294" wp14:editId="6984D7A1">
+            <wp:extent cx="5943600" cy="2995295"/>
+            <wp:effectExtent l="0" t="0" r="0" b="0"/>
+            <wp:docPr id="1843156408" name="Picture 1"/>
             <wp:cNvGraphicFramePr>
               <a:graphicFrameLocks xmlns:a="http://schemas.openxmlformats.org/drawingml/2006/main" noChangeAspect="1"/>
             </wp:cNvGraphicFramePr>
@@ -4215,11 +4099,11 @@
               <a:graphicData uri="http://schemas.openxmlformats.org/drawingml/2006/picture">
                 <pic:pic xmlns:pic="http://schemas.openxmlformats.org/drawingml/2006/picture">
                   <pic:nvPicPr>
-                    <pic:cNvPr id="27693877" name=""/>
+                    <pic:cNvPr id="1843156408" name=""/>
                     <pic:cNvPicPr/>
                   </pic:nvPicPr>
                   <pic:blipFill>
-                    <a:blip r:embed="rId15"/>
+                    <a:blip r:embed="rId16"/>
                     <a:stretch>
                       <a:fillRect/>
                     </a:stretch>
@@ -4227,7 +4111,7 @@
                   <pic:spPr>
                     <a:xfrm>
                       <a:off x="0" y="0"/>
-                      <a:ext cx="5943600" cy="2969895"/>
+                      <a:ext cx="5943600" cy="2995295"/>
                     </a:xfrm>
                     <a:prstGeom prst="rect">
                       <a:avLst/>
@@ -4392,12 +4276,6 @@
         <w:gridCol w:w="1660"/>
       </w:tblGrid>
       <w:tr>
-        <w:tblPrEx>
-          <w:tblCellMar>
-            <w:top w:w="0" w:type="dxa"/>
-            <w:bottom w:w="0" w:type="dxa"/>
-          </w:tblCellMar>
-        </w:tblPrEx>
         <w:trPr>
           <w:tblHeader/>
         </w:trPr>
@@ -4547,12 +4425,6 @@
         </w:tc>
       </w:tr>
       <w:tr>
-        <w:tblPrEx>
-          <w:tblCellMar>
-            <w:top w:w="0" w:type="dxa"/>
-            <w:bottom w:w="0" w:type="dxa"/>
-          </w:tblCellMar>
-        </w:tblPrEx>
         <w:tc>
           <w:tcPr>
             <w:tcW w:w="2900" w:type="dxa"/>
@@ -4677,12 +4549,6 @@
         </w:tc>
       </w:tr>
       <w:tr>
-        <w:tblPrEx>
-          <w:tblCellMar>
-            <w:top w:w="0" w:type="dxa"/>
-            <w:bottom w:w="0" w:type="dxa"/>
-          </w:tblCellMar>
-        </w:tblPrEx>
         <w:tc>
           <w:tcPr>
             <w:tcW w:w="2900" w:type="dxa"/>
@@ -4845,6 +4711,7 @@
           <w:bCs/>
           <w:i/>
           <w:iCs/>
+          <w:noProof/>
           <w:color w:val="C00000"/>
           <w:sz w:val="20"/>
           <w:szCs w:val="20"/>
@@ -4865,7 +4732,7 @@
                     <pic:cNvPicPr/>
                   </pic:nvPicPr>
                   <pic:blipFill>
-                    <a:blip r:embed="rId16"/>
+                    <a:blip r:embed="rId17"/>
                     <a:stretch>
                       <a:fillRect/>
                     </a:stretch>
@@ -4925,15 +4792,16 @@
         <w:spacing w:after="200"/>
         <w:ind w:left="200"/>
       </w:pPr>
-      <w:r>
-        <w:rPr>
-          <w:b/>
-          <w:bCs/>
-          <w:color w:val="C00000"/>
-        </w:rPr>
-        <w:lastRenderedPageBreak/>
-        <w:t>&lt;INSERT GITHUB REPOSITORY LINK&gt;</w:t>
-      </w:r>
+      <w:hyperlink r:id="rId18" w:history="1">
+        <w:r>
+          <w:rPr>
+            <w:rStyle w:val="Hyperlink"/>
+            <w:b/>
+            <w:bCs/>
+          </w:rPr>
+          <w:t>&lt;INSERT GITHUB REPOSITORY LINK&gt;</w:t>
+        </w:r>
+      </w:hyperlink>
     </w:p>
     <w:p>
       <w:pPr>
@@ -4941,20 +4809,6 @@
       </w:pPr>
       <w:r>
         <w:t>A short video recording of the overall pipeline in action:</w:t>
-      </w:r>
-    </w:p>
-    <w:p>
-      <w:pPr>
-        <w:spacing w:after="200"/>
-        <w:ind w:left="200"/>
-      </w:pPr>
-      <w:r>
-        <w:rPr>
-          <w:b/>
-          <w:bCs/>
-          <w:color w:val="C00000"/>
-        </w:rPr>
-        <w:t>&lt;INSERT GOOGLE DRIVE VIDEO LINK&gt;</w:t>
       </w:r>
     </w:p>
     <w:p>
@@ -5669,6 +5523,18 @@
       <w:szCs w:val="20"/>
     </w:rPr>
   </w:style>
+  <w:style w:type="character" w:styleId="UnresolvedMention">
+    <w:name w:val="Unresolved Mention"/>
+    <w:basedOn w:val="DefaultParagraphFont"/>
+    <w:uiPriority w:val="99"/>
+    <w:semiHidden/>
+    <w:unhideWhenUsed/>
+    <w:rsid w:val="006D71D4"/>
+    <w:rPr>
+      <w:color w:val="605E5C"/>
+      <w:shd w:val="clear" w:color="auto" w:fill="E1DFDD"/>
+    </w:rPr>
+  </w:style>
 </w:styles>
 </file>
 

</xml_diff>